<commit_message>
Translate Annex №41 National Legal Basis for Diploma & Supplement Standard to Uzbek
Complete translation of Cabinet of Ministers Resolution No. 607
on state diploma samples for bachelor's and master's degrees,
including diploma descriptions, protection levels, diploma
supplement templates, and academic transcript standards.

Co-Authored-By: Claude Opus 4.6 <noreply@anthropic.com>
Claude-Session: https://claude.ai/code/session_01N9ZP28hxEfPoWHf2qaE8QM
</commit_message>
<xml_diff>
--- a/Computer Engineering, Software Engineering, Computer systems & their softwares/Annexes/Annex №41 National Legal Basis for Diploma & Supplement Standard.docx
+++ b/Computer Engineering, Software Engineering, Computer systems & their softwares/Annexes/Annex №41 National Legal Basis for Diploma & Supplement Standard.docx
@@ -7,15 +7,35 @@
         <w:jc w:val="both"/>
       </w:pPr>
       <w:r>
-        <w:t xml:space="preserve">Resolution of the Cabinet of Ministers of the Republic of Uzbekistan, </w:t>
+        <w:t>O'zbekiston Respublikasi Vazirlar Mahkamasining qarori, 19.07.2019 y. № 607</w:t>
       </w:r>
       <w:proofErr w:type="spellStart"/>
+      <w:r/>
+      <w:proofErr w:type="spellEnd"/>
+      <w:r/>
+    </w:p>
+    <w:p>
+      <w:pPr>
+        <w:jc w:val="center"/>
+        <w:rPr>
+          <w:b/>
+          <w:bCs w:val="0"/>
+        </w:rPr>
+      </w:pPr>
       <w:r>
-        <w:t>от</w:t>
+        <w:rPr>
+          <w:b/>
+          <w:bCs w:val="0"/>
+        </w:rPr>
+        <w:t>QAROR</w:t>
       </w:r>
-      <w:proofErr w:type="spellEnd"/>
+    </w:p>
+    <w:p>
+      <w:pPr>
+        <w:jc w:val="center"/>
+      </w:pPr>
       <w:r>
-        <w:t xml:space="preserve"> 19.07.2019 г. № 607</w:t>
+        <w:t>O'zbekiston Respublikasi Vazirlar Mahkamasining</w:t>
       </w:r>
     </w:p>
     <w:p>
@@ -31,101 +51,67 @@
           <w:b/>
           <w:bCs w:val="0"/>
         </w:rPr>
-        <w:t>RESOLUTION</w:t>
-      </w:r>
-    </w:p>
-    <w:p>
-      <w:pPr>
-        <w:jc w:val="center"/>
-      </w:pPr>
-      <w:r>
-        <w:t>of the Cabinet of Ministers of the Republic of Uzbekistan</w:t>
-      </w:r>
-    </w:p>
-    <w:p>
-      <w:pPr>
-        <w:jc w:val="center"/>
-        <w:rPr>
-          <w:b/>
-          <w:bCs w:val="0"/>
-        </w:rPr>
-      </w:pPr>
-      <w:r>
-        <w:rPr>
-          <w:b/>
-          <w:bCs w:val="0"/>
-        </w:rPr>
-        <w:t xml:space="preserve">On approval of the State samples of </w:t>
+        <w:t>Oliy ta'limning bakalavriat va magistratura diplom Davlat namunalarini tasdiqlash to'g'risida</w:t>
       </w:r>
       <w:r>
         <w:rPr>
           <w:b/>
           <w:bCs w:val="0"/>
         </w:rPr>
-        <w:t>D</w:t>
       </w:r>
       <w:r>
         <w:rPr>
           <w:b/>
           <w:bCs w:val="0"/>
         </w:rPr>
-        <w:t xml:space="preserve">iplomas for </w:t>
       </w:r>
       <w:r>
         <w:rPr>
           <w:b/>
           <w:bCs w:val="0"/>
         </w:rPr>
-        <w:t>B</w:t>
       </w:r>
       <w:r>
         <w:rPr>
           <w:b/>
           <w:bCs w:val="0"/>
         </w:rPr>
-        <w:t xml:space="preserve">achelor's and </w:t>
       </w:r>
       <w:r>
         <w:rPr>
           <w:b/>
           <w:bCs w:val="0"/>
         </w:rPr>
-        <w:t>M</w:t>
       </w:r>
       <w:r>
         <w:rPr>
           <w:b/>
           <w:bCs w:val="0"/>
         </w:rPr>
-        <w:t xml:space="preserve">aster's degrees in </w:t>
       </w:r>
       <w:r>
         <w:rPr>
           <w:b/>
           <w:bCs w:val="0"/>
         </w:rPr>
-        <w:t>H</w:t>
       </w:r>
       <w:r>
         <w:rPr>
           <w:b/>
           <w:bCs w:val="0"/>
         </w:rPr>
-        <w:t xml:space="preserve">igher </w:t>
       </w:r>
       <w:r>
         <w:rPr>
           <w:b/>
           <w:bCs w:val="0"/>
         </w:rPr>
-        <w:t>E</w:t>
       </w:r>
       <w:r>
         <w:rPr>
           <w:b/>
           <w:bCs w:val="0"/>
         </w:rPr>
-        <w:t>ducation</w:t>
       </w:r>
     </w:p>
     <w:p>
@@ -133,7 +119,7 @@
         <w:jc w:val="both"/>
       </w:pPr>
       <w:r>
-        <w:t>In order to issue state-standard bachelor's and master's diplomas to graduates of higher education institutions based on state educational standards, expand the possibilities of obtaining information in the diploma and its appendix, and bring them into line with models used in advanced foreign practice, the Cabinet of Ministers decides:</w:t>
+        <w:t>Davlat ta'lim standartlari asosida oliy ta'lim muassasalari bitiruvchilariga davlat namunaviy bakalavriat va magistratura diplomlarini berish, o'qish davomida o'zlashtirilgan fanlar, amaliyotlar va yakuniy davlat attestatsiyasi natijalari to'g'risidagi ma'lumotlarni olish imkoniyatlarini kengaytirish, shuningdek akademik mobillikni ta'minlash maqsadida Vazirlar Mahkamasi qaror qiladi:</w:t>
       </w:r>
     </w:p>
     <w:p>
@@ -141,7 +127,7 @@
         <w:jc w:val="both"/>
       </w:pPr>
       <w:r>
-        <w:t>1. The following:</w:t>
+        <w:t>1. Quyidagilar:</w:t>
       </w:r>
     </w:p>
     <w:p>
@@ -149,7 +135,7 @@
         <w:jc w:val="both"/>
       </w:pPr>
       <w:r>
-        <w:t xml:space="preserve">State samples of bachelor's and master's diplomas of higher education and their descriptions are in accordance with </w:t>
+        <w:t>Oliy ta'limning bakalavriat va magistratura diplomlarining Davlat namunalari va ularning tavsiflari 1-ilovaga muvofiq;</w:t>
       </w:r>
       <w:hyperlink r:id="rId6" w:anchor="-4431139" w:history="1">
         <w:r>
@@ -159,16 +145,14 @@
           <w:t>Appendix 1</w:t>
         </w:r>
       </w:hyperlink>
-      <w:r>
-        <w:t xml:space="preserve"> ;</w:t>
-      </w:r>
+      <w:r/>
     </w:p>
     <w:p>
       <w:pPr>
         <w:jc w:val="both"/>
       </w:pPr>
       <w:r>
-        <w:t xml:space="preserve">State samples of applications for bachelor's and master's diplomas of higher education in accordance with </w:t>
+        <w:t>Oliy ta'limning bakalavriat va magistratura diplomlariga ilovalarning Davlat namunalari 2-ilovaga muvofiq;</w:t>
       </w:r>
       <w:hyperlink r:id="rId7" w:anchor="-4432207" w:history="1">
         <w:r>
@@ -178,16 +162,14 @@
           <w:t>Appendix 2</w:t>
         </w:r>
       </w:hyperlink>
-      <w:r>
-        <w:t xml:space="preserve"> ;</w:t>
-      </w:r>
+      <w:r/>
     </w:p>
     <w:p>
       <w:pPr>
         <w:jc w:val="both"/>
       </w:pPr>
       <w:r>
-        <w:t xml:space="preserve">The state sample and description of the academic transcript issued in higher education institutions shall be approved in accordance with </w:t>
+        <w:t>Oliy ta'lim muassasalarida beriladigan akademik ma'lumotnomaning Davlat namunasi va tavsifi 3-ilovaga muvofiq tasdiqlansin.</w:t>
       </w:r>
       <w:hyperlink r:id="rId8" w:anchor="-4432567" w:history="1">
         <w:r>
@@ -197,8 +179,14 @@
           <w:t>Appendix 3</w:t>
         </w:r>
       </w:hyperlink>
+      <w:r/>
+    </w:p>
+    <w:p>
+      <w:pPr>
+        <w:jc w:val="both"/>
+      </w:pPr>
       <w:r>
-        <w:t xml:space="preserve"> .</w:t>
+        <w:t>Oliy ta'limning bakalavriat va magistratura diplomlari va ilovalarining Davlat namunalari 2019/2020 o'quv yilidan boshlab joriy etilishi belgilansin.</w:t>
       </w:r>
     </w:p>
     <w:p>
@@ -206,7 +194,23 @@
         <w:jc w:val="both"/>
       </w:pPr>
       <w:r>
-        <w:t>It is determined that state samples of bachelor's and master's diplomas and applications for higher education will be introduced starting from the 2019/2020 academic year.</w:t>
+        <w:t>2. O'zbekiston Respublikasi Markaziy banki huzuridagi "Davlat belgisi" davlat unitar korxonasi oliy ta'limning bakalavriat va magistratura diplomlari va ularga ilovalar blankalari, shuningdek akademik ma'lumotnoma blankalari O'zbekiston Respublikasi Oliy va o'rta maxsus ta'lim vazirligi buyurtmalari asosida tegishli miqdorda tayyorlanishini ta'minlasin.</w:t>
+      </w:r>
+      <w:proofErr w:type="spellStart"/>
+      <w:r/>
+      <w:proofErr w:type="spellEnd"/>
+      <w:r/>
+      <w:proofErr w:type="spellStart"/>
+      <w:r/>
+      <w:proofErr w:type="spellEnd"/>
+      <w:r/>
+    </w:p>
+    <w:p>
+      <w:pPr>
+        <w:jc w:val="both"/>
+      </w:pPr>
+      <w:r>
+        <w:t>3. Quyidagilar belgilansin:</w:t>
       </w:r>
     </w:p>
     <w:p>
@@ -214,23 +218,16 @@
         <w:jc w:val="both"/>
       </w:pPr>
       <w:r>
-        <w:t>2. The State Unitary Enterprise "</w:t>
+        <w:t>Oliy ta'limning bakalavriat va magistratura diplomlari, ularga ilovalar va akademik ma'lumotnoma blankalari tayyorlash bilan bog'liq xarajatlarni moliyalashtirish har yili O'zbekiston Respublikasi Oliy va o'rta maxsus ta'lim vazirligi uchun ajratilgan byudjet mablag'lari doirasida amalga oshiriladi.</w:t>
       </w:r>
-      <w:proofErr w:type="spellStart"/>
+      <w:r/>
+    </w:p>
+    <w:p>
+      <w:pPr>
+        <w:jc w:val="both"/>
+      </w:pPr>
       <w:r>
-        <w:t>Davlat</w:t>
-      </w:r>
-      <w:proofErr w:type="spellEnd"/>
-      <w:r>
-        <w:t xml:space="preserve"> </w:t>
-      </w:r>
-      <w:proofErr w:type="spellStart"/>
-      <w:r>
-        <w:t>Belgisi</w:t>
-      </w:r>
-      <w:proofErr w:type="spellEnd"/>
-      <w:r>
-        <w:t>" under the Central Bank of the Republic of Uzbekistan shall ensure that bachelor's and master's diplomas of higher education and forms of applications to these diplomas are prepared on special protected paper based on the orders of the Ministry of Higher and Secondary Specialized Education of the Republic of Uzbekistan.</w:t>
+        <w:t>Oliy ta'limning bakalavriat va magistratura diplomlari, ularga ilovalar va akademik ma'lumotnoma blankalari kompyuterda to'ldiriladi va oliy ta'lim muassasalari bitiruvchilariga bepul tarqatiladi.</w:t>
       </w:r>
     </w:p>
     <w:p>
@@ -238,7 +235,7 @@
         <w:jc w:val="both"/>
       </w:pPr>
       <w:r>
-        <w:t>3. It is determined that:</w:t>
+        <w:t>4. O'zbekiston Respublikasi Oliy va o'rta maxsus ta'lim vazirligi oliy ta'limning bakalavriat va magistratura diplomlariga, shuningdek akademik ma'lumotnomaga individual QR-kodlarni joylashtirish tizimini ishlab chiqishni ta'minlasin.</w:t>
       </w:r>
     </w:p>
     <w:p>
@@ -246,35 +243,7 @@
         <w:jc w:val="both"/>
       </w:pPr>
       <w:r>
-        <w:t xml:space="preserve">Financing of expenses related to the preparation of bachelor's and master's diplomas of higher education, their supplements and academic reference </w:t>
-      </w:r>
-      <w:r>
-        <w:lastRenderedPageBreak/>
-        <w:t>forms is carried out annually within the budget funds allocated for these purposes to the Ministry of Higher and Secondary Specialized Education of the Republic of Uzbekistan based on accurate calculations;</w:t>
-      </w:r>
-    </w:p>
-    <w:p>
-      <w:pPr>
-        <w:jc w:val="both"/>
-      </w:pPr>
-      <w:r>
-        <w:t>Bachelor's and master's diplomas of higher education, their appendices, and academic reference forms are filled out on a computer and distributed free of charge to graduates of higher education institutions (except for cases of issuing duplicates).</w:t>
-      </w:r>
-    </w:p>
-    <w:p>
-      <w:pPr>
-        <w:jc w:val="both"/>
-      </w:pPr>
-      <w:r>
-        <w:t>4. The Ministry of Higher and Secondary Specialized Education of the Republic of Uzbekistan shall ensure the development of a system for placing individual QR codes on bachelor's and master's diplomas and its software within three months.</w:t>
-      </w:r>
-    </w:p>
-    <w:p>
-      <w:pPr>
-        <w:jc w:val="both"/>
-      </w:pPr>
-      <w:r>
-        <w:t>In this case, the costs associated with the development of the QR code system and its software will be covered by the Fund for the Development of Higher Educational Institutions of the Ministry of Higher and Secondary Specialized Education of the Republic of Uzbekistan.</w:t>
+        <w:t>Bunda QR-kod tizimini ishlab chiqish va uning dasturiy ta'minoti bilan bog'liq xarajatlar O'zbekiston Respublikasi Oliy va o'rta maxsus ta'lim vazirligi Oliy ta'lim muassasalarini rivojlantirish jamg'armasi mablag'lari hisobidan qoplanadi.</w:t>
       </w:r>
     </w:p>
     <w:p>
@@ -290,7 +259,7 @@
         </w:r>
       </w:hyperlink>
       <w:r>
-        <w:t xml:space="preserve"> of the Cabinet of Ministers No. 282 of June 2, 1999 “On admission to higher educational institutions of the Republic of Uzbekistan in the 1999/2000 academic year” shall be deemed to have lost its force.</w:t>
+        <w:t>5. Vazirlar Mahkamasining 1999 yil 2 iyundagi "O'zbekiston Respublikasi oliy o'quv yurtlariga 1999/2000 o'quv yiliga qabul qilish to'g'risida"gi 282-sonli qarori o'z kuchini yo'qotgan deb hisoblansin.</w:t>
       </w:r>
     </w:p>
     <w:p>
@@ -298,7 +267,7 @@
         <w:jc w:val="both"/>
       </w:pPr>
       <w:r>
-        <w:t>6. The Ministry of Higher and Secondary Specialized Education of the Republic of Uzbekistan, together with interested ministries and departments, shall bring the regulatory legal acts they have adopted into line with this resolution within one month.</w:t>
+        <w:t>6. O'zbekiston Respublikasi Oliy va o'rta maxsus ta'lim vazirligi manfaatdor vazirliklar va idoralar bilan birgalikda ular tomonidan qabul qilingan me'yoriy-huquqiy hujjatlarni ushbu qarorga muvofiq keltirishni ta'minlasin.</w:t>
       </w:r>
     </w:p>
     <w:p>
@@ -306,23 +275,85 @@
         <w:jc w:val="both"/>
       </w:pPr>
       <w:r>
-        <w:t xml:space="preserve">7. Control over the implementation of this resolution shall be entrusted to the Deputy Prime Minister of the Republic of Uzbekistan for Social Development AA </w:t>
+        <w:t>7. Ushbu qaror ijrosini nazorat qilish O'zbekiston Respublikasi Bosh vazirining Ijtimoiy rivojlanish masalalari bo'yicha o'rinbosari A.A. Abduhakimov va Oliy va o'rta maxsus ta'lim vaziri zimmasiga yuklansin.</w:t>
       </w:r>
       <w:proofErr w:type="spellStart"/>
+      <w:r/>
+      <w:proofErr w:type="spellEnd"/>
+      <w:r/>
+      <w:proofErr w:type="spellStart"/>
+      <w:r/>
+      <w:proofErr w:type="spellEnd"/>
+      <w:r/>
+    </w:p>
+    <w:p>
+      <w:pPr>
+        <w:jc w:val="both"/>
+        <w:rPr>
+          <w:b/>
+        </w:rPr>
+      </w:pPr>
       <w:r>
-        <w:t>Abdukhakimov</w:t>
+        <w:rPr>
+          <w:b/>
+        </w:rPr>
+        <w:t>O'zbekiston Respublikasi Bosh vaziri A. ARIPOV</w:t>
       </w:r>
-      <w:proofErr w:type="spellEnd"/>
+    </w:p>
+    <w:p>
+      <w:pPr>
+        <w:jc w:val="both"/>
+      </w:pPr>
       <w:r>
-        <w:t xml:space="preserve"> and the Minister of Higher and Secondary Specialized Education IU </w:t>
+        <w:t>Toshkent shahri,</w:t>
       </w:r>
-      <w:proofErr w:type="spellStart"/>
+    </w:p>
+    <w:p>
+      <w:pPr>
+        <w:jc w:val="both"/>
+      </w:pPr>
       <w:r>
-        <w:t>Madjidov</w:t>
+        <w:t>2019 yil 19 iyul,</w:t>
       </w:r>
-      <w:proofErr w:type="spellEnd"/>
+    </w:p>
+    <w:p>
+      <w:pPr>
+        <w:jc w:val="both"/>
+      </w:pPr>
       <w:r>
-        <w:t>.</w:t>
+        <w:t>607-son</w:t>
+      </w:r>
+    </w:p>
+    <w:p>
+      <w:pPr>
+        <w:jc w:val="both"/>
+      </w:pPr>
+      <w:r>
+        <w:t>Vazirlar Mahkamasining 2019 yil 19 iyuldagi 607-sonli qaroriga 1-ILOVA</w:t>
+      </w:r>
+      <w:hyperlink r:id="rId10" w:history="1">
+        <w:r>
+          <w:rPr>
+            <w:rStyle w:val="ac"/>
+          </w:rPr>
+          <w:t>to the Resolution</w:t>
+        </w:r>
+      </w:hyperlink>
+      <w:r/>
+      <w:r/>
+    </w:p>
+    <w:p>
+      <w:pPr>
+        <w:jc w:val="both"/>
+        <w:rPr>
+          <w:b/>
+        </w:rPr>
+      </w:pPr>
+      <w:r>
+        <w:rPr>
+          <w:b/>
+        </w:rPr>
+        <w:t>Oliy ta'limning bakalavriat va magistratura diplomlarining Davlat namunalari va ularning tavsiflari</w:t>
       </w:r>
     </w:p>
     <w:p>
@@ -336,82 +367,7 @@
         <w:rPr>
           <w:b/>
         </w:rPr>
-        <w:t>Prime Minister of the Republic of Uzbekistan A. ARIPOV</w:t>
-      </w:r>
-    </w:p>
-    <w:p>
-      <w:pPr>
-        <w:jc w:val="both"/>
-      </w:pPr>
-      <w:r>
-        <w:t>Tashkent city,</w:t>
-      </w:r>
-    </w:p>
-    <w:p>
-      <w:pPr>
-        <w:jc w:val="both"/>
-      </w:pPr>
-      <w:r>
-        <w:t>July 19, 2019,</w:t>
-      </w:r>
-    </w:p>
-    <w:p>
-      <w:pPr>
-        <w:jc w:val="both"/>
-      </w:pPr>
-      <w:r>
-        <w:t>Issue 607</w:t>
-      </w:r>
-    </w:p>
-    <w:p>
-      <w:pPr>
-        <w:jc w:val="both"/>
-      </w:pPr>
-      <w:r>
-        <w:lastRenderedPageBreak/>
-        <w:t xml:space="preserve">ANNEX 1 </w:t>
-      </w:r>
-      <w:hyperlink r:id="rId10" w:history="1">
-        <w:r>
-          <w:rPr>
-            <w:rStyle w:val="ac"/>
-          </w:rPr>
-          <w:t>to the Resolution</w:t>
-        </w:r>
-      </w:hyperlink>
-      <w:r>
-        <w:t xml:space="preserve"> of the Cabinet of Ministers No. 607 of July 19, 2019</w:t>
-      </w:r>
-      <w:r>
-        <w:br/>
-      </w:r>
-    </w:p>
-    <w:p>
-      <w:pPr>
-        <w:jc w:val="both"/>
-        <w:rPr>
-          <w:b/>
-        </w:rPr>
-      </w:pPr>
-      <w:r>
-        <w:rPr>
-          <w:b/>
-        </w:rPr>
-        <w:t>State samples of bachelor's and master's diplomas of higher education and their descriptions</w:t>
-      </w:r>
-    </w:p>
-    <w:p>
-      <w:pPr>
-        <w:jc w:val="both"/>
-        <w:rPr>
-          <w:b/>
-        </w:rPr>
-      </w:pPr>
-      <w:r>
-        <w:rPr>
-          <w:b/>
-        </w:rPr>
-        <w:t>I. BACHELOR'S DIPLOMA</w:t>
+        <w:t>I. BAKALAVRIAT DIPLOMI</w:t>
       </w:r>
     </w:p>
     <w:p>
@@ -592,7 +548,7 @@
         <w:rPr>
           <w:b/>
         </w:rPr>
-        <w:t>Bachelor's diploma of higher education of the state sample</w:t>
+        <w:t>Oliy ta'limning Davlat namunaviy bakalavriat diplomi</w:t>
       </w:r>
     </w:p>
     <w:p>
@@ -606,7 +562,7 @@
         <w:rPr>
           <w:b/>
         </w:rPr>
-        <w:t>DESCRIPTION</w:t>
+        <w:t>TAVSIF</w:t>
       </w:r>
     </w:p>
     <w:p>
@@ -614,7 +570,7 @@
         <w:jc w:val="both"/>
       </w:pPr>
       <w:r>
-        <w:t>The cover of the bachelor's diploma is made of dark blue artificial leather with a single-sided cover measuring 148x210 mm.</w:t>
+        <w:t>Bakalavriat diplomining muqovasi 148x210 mm o'lchamli bir tomonlama muqovali to'q ko'k rangli sun'iy charm ko'rinishida tayyorlanadi.</w:t>
       </w:r>
     </w:p>
     <w:p>
@@ -622,7 +578,7 @@
         <w:jc w:val="both"/>
       </w:pPr>
       <w:r>
-        <w:t>On its front side, the State Emblem of the Republic of Uzbekistan is embossed, and below it, in Latin script, the words BAKALAVR DIPLOMI are written in Uzbek.</w:t>
+        <w:t>Uning old tomonida O'zbekiston Respublikasining Davlat gerbi bo'rttirilgan, uning ostida lotin yozuvida o'zbek tilida BAKALAVR DIPLOMI so'zlari yozilgan.</w:t>
       </w:r>
     </w:p>
     <w:p>
@@ -630,8 +586,7 @@
         <w:jc w:val="both"/>
       </w:pPr>
       <w:r>
-        <w:lastRenderedPageBreak/>
-        <w:t>The diploma cover is printed on thick, watermarked paper with sides measuring 145x200 mm, offset printed in five colors: the text is printed in black and dark blue, and the graphic elements are printed in blue and light blue;</w:t>
+        <w:t>Diplom muqovasining ichi tomonlari 145x200 mm o'lchamli suv belgilari bo'lgan qalin qog'ozga bosma usulida besh rangda bosiladi: matn qora va to'q ko'k rangda, grafik elementlar esa och ko'k va sariq rangda bosiladi.</w:t>
       </w:r>
     </w:p>
     <w:p>
@@ -639,7 +594,7 @@
         <w:jc w:val="both"/>
       </w:pPr>
       <w:r>
-        <w:t>The State Emblem of the Republic of Uzbekistan, painted in a unique light blue color with sides measuring 80x82 mm, is placed in the white part of the center of the page. It is surrounded by a light blue background with a small national pattern consisting of a patterned raster. A 20 mm wide light blue border is drawn over the background in the upper part of the page, and the words “UBEKISTON RESPUBLIKASI BAKALAVR DIPLOMI” and “REPUBLIC OF UZBEKISTAN BACHELOR'S DIPLOMA” are printed on both pages of the diploma above the border;</w:t>
+        <w:t>Sahifaning markaziy oq qismida 80x82 mm o'lchamli o'ziga xos och ko'k rangda bo'yalgan O'zbekiston Respublikasining Davlat gerbi tasviri joylashtirilgan. Uni och ko'k rangli halqasimon naqsh o'rab turadi.</w:t>
       </w:r>
     </w:p>
     <w:p>
@@ -647,7 +602,7 @@
         <w:jc w:val="both"/>
       </w:pPr>
       <w:r>
-        <w:t>The Latin letter V and an eight-digit number are printed in dark blue at the bottom of the border of both pages of the diploma.</w:t>
+        <w:t>Diplom ikkala sahifasining chegarasining pastki qismida lotin harfi V va sakkiz xonali raqam to'q ko'k rangda bosilgan.</w:t>
       </w:r>
     </w:p>
     <w:p>
@@ -655,7 +610,7 @@
         <w:jc w:val="both"/>
       </w:pPr>
       <w:r>
-        <w:t>For diplomas with honors, the words "IMTIYOZLI" in Uzbek and "WITH HONOURS" in English are written in gold paint below the words "UZBEKISTAN REPUBLIKASI BAKALAVR DIPLOMI" and "REPUBLIC OF UZBEKISTAN BACHELOR'S DIPLOMA" in Latin script.</w:t>
+        <w:t>Imtiyozli diplomlarda "O'ZBEKISTON RESPUBLIKASI BAKALAVR DIPLOMI" va "REPUBLIC OF UZBEKISTAN BACHELOR'S DIPLOMA" so'zlari ostida oltin rangda "IMTIYOZLI" o'zbek tilida va "WITH HONOURS" ingliz tilida so'zlari yozilgan.</w:t>
       </w:r>
     </w:p>
     <w:p>
@@ -663,7 +618,7 @@
         <w:jc w:val="both"/>
       </w:pPr>
       <w:r>
-        <w:t>A golden image of an eight-pointed star is placed on both sides of each page. The eight-pointed stars are formed by inserting squares with sides of 15x15 mm. Also, a QR code system of 35x35 mm in size without a background is placed at the bottom right of the diploma form.</w:t>
+        <w:t>Har bir sahifaning ikki tomonida sakkiz qirrali yulduzning oltin rangli tasviri joylashtirilgan. Sakkiz qirrali yulduzlar 15x15 mm tomonlari bo'lgan kvadratlarni kiritish orqali hosil qilinadi. Shuningdek, 35x35 mm o'lchamli QR-kod tizimi joylashtirilgan.</w:t>
       </w:r>
     </w:p>
     <w:p>
@@ -671,7 +626,7 @@
         <w:jc w:val="both"/>
       </w:pPr>
       <w:r>
-        <w:t>The diploma has 7 levels of protection:</w:t>
+        <w:t>Diplomda 7 daraja himoya mavjud:</w:t>
       </w:r>
     </w:p>
     <w:p>
@@ -679,7 +634,7 @@
         <w:jc w:val="both"/>
       </w:pPr>
       <w:r>
-        <w:t>1) using two different printing methods: offset printing method for the main part, and high-speed printing method for printing numbers;</w:t>
+        <w:t>1) ikki xil bosma usulidan foydalanish: asosiy qism uchun ofset bosma usuli, raqamlarni bosish uchun esa tezkor bosma usuli;</w:t>
       </w:r>
     </w:p>
     <w:p>
@@ -687,7 +642,7 @@
         <w:jc w:val="both"/>
       </w:pPr>
       <w:r>
-        <w:t>2) use of non-toxic inks that make copying by machine difficult;</w:t>
+        <w:t>2) mashina yordamida nusxalashni qiyinlashtiradigan zaharli bo'lmagan bo'yoqlardan foydalanish;</w:t>
       </w:r>
     </w:p>
     <w:p>
@@ -695,7 +650,7 @@
         <w:jc w:val="both"/>
       </w:pPr>
       <w:r>
-        <w:t>3) printing a small national pattern in the background using raster grids;</w:t>
+        <w:t>3) fonda rastr panjaralari yordamida mayda milliy naqshni bosish;</w:t>
       </w:r>
     </w:p>
     <w:p>
@@ -703,17 +658,14 @@
         <w:jc w:val="both"/>
       </w:pPr>
       <w:r>
-        <w:t>4) use of watermarked paper with a special national ornamental pattern and a density of 120 g/m</w:t>
+        <w:t>4) maxsus milliy naqshli va 120 g/m2 zichligi bo'lgan suv belgilari qog'ozidan foydalanish;</w:t>
       </w:r>
       <w:proofErr w:type="gramStart"/>
-      <w:r>
-        <w:t xml:space="preserve">2 </w:t>
-      </w:r>
+      <w:r/>
       <w:r>
         <w:rPr>
           <w:vertAlign w:val="superscript"/>
         </w:rPr>
-        <w:t>;</w:t>
       </w:r>
       <w:proofErr w:type="gramEnd"/>
     </w:p>
@@ -722,7 +674,7 @@
         <w:jc w:val="both"/>
       </w:pPr>
       <w:r>
-        <w:t>5) Depicting the state emblem in light blue;</w:t>
+        <w:t>5) davlat gerbini och ko'k rangda tasvirlash;</w:t>
       </w:r>
     </w:p>
     <w:p>
@@ -730,8 +682,7 @@
         <w:jc w:val="both"/>
       </w:pPr>
       <w:r>
-        <w:lastRenderedPageBreak/>
-        <w:t>6) depicting eight-pointed stars in special shiny gold paints;</w:t>
+        <w:t>6) sakkiz qirrali yulduzlarni maxsus yaltiroq oltin bo'yoqlarda tasvirlash;</w:t>
       </w:r>
     </w:p>
     <w:p>
@@ -739,7 +690,7 @@
         <w:jc w:val="both"/>
       </w:pPr>
       <w:r>
-        <w:t>7) Using a figure-of-eight variable number.</w:t>
+        <w:t>7) sakkizlik o'zgaruvchan raqamdan foydalanish.</w:t>
       </w:r>
     </w:p>
     <w:p>
@@ -753,7 +704,7 @@
         <w:rPr>
           <w:b/>
         </w:rPr>
-        <w:t>II. MASTER'S DIPLOMA</w:t>
+        <w:t>II. MAGISTRATURA DIPLOMI</w:t>
       </w:r>
     </w:p>
     <w:p>
@@ -934,7 +885,7 @@
         <w:rPr>
           <w:b/>
         </w:rPr>
-        <w:t>Master's degree diploma of higher education of the state sample</w:t>
+        <w:t>Oliy ta'limning Davlat namunaviy magistratura diplomi</w:t>
       </w:r>
     </w:p>
     <w:p>
@@ -948,7 +899,7 @@
         <w:rPr>
           <w:b/>
         </w:rPr>
-        <w:t>DESCRIPTION</w:t>
+        <w:t>TAVSIF</w:t>
       </w:r>
     </w:p>
     <w:p>
@@ -956,7 +907,7 @@
         <w:jc w:val="both"/>
       </w:pPr>
       <w:r>
-        <w:t>The cover of the master's diploma looks like it is made of dark red artificial leather with a solid cover on the sides, measuring 148x210 mm.</w:t>
+        <w:t>Magistratura diplomining muqovasi 148x210 mm o'lchamli yaxlit muqovali to'q qizil rangli sun'iy charm ko'rinishida tayyorlanadi.</w:t>
       </w:r>
     </w:p>
     <w:p>
@@ -964,8 +915,7 @@
         <w:jc w:val="both"/>
       </w:pPr>
       <w:r>
-        <w:lastRenderedPageBreak/>
-        <w:t>On its front side, the State Emblem of the Republic of Uzbekistan is embossed, and below it, in Latin script, the words MASTER'S DEGREE are written in Uzbek.</w:t>
+        <w:t>Uning old tomonida O'zbekiston Respublikasining Davlat gerbi bo'rttirilgan, uning ostida lotin yozuvida o'zbek tilida MAGISTR DIPLOMI so'zlari yozilgan.</w:t>
       </w:r>
     </w:p>
     <w:p>
@@ -973,7 +923,7 @@
         <w:jc w:val="both"/>
       </w:pPr>
       <w:r>
-        <w:t>The inside of the diploma cover is printed on thick, watermarked paper measuring 145x200 mm, offset printed in five colors: the text is printed in black and dark red, and the graphic elements are printed in cream and light cream.</w:t>
+        <w:t>Diplom muqovasining ichi tomonlari 145x200 mm o'lchamli suv belgilari bo'lgan qalin qog'ozga bosma usulida besh rangda bosiladi: matn qora va to'q qizil rangda, grafik elementlar esa karamel va sariq rangda bosiladi.</w:t>
       </w:r>
     </w:p>
     <w:p>
@@ -981,7 +931,7 @@
         <w:jc w:val="both"/>
       </w:pPr>
       <w:r>
-        <w:t>In the white part of the center of the page, an image of the State Emblem of the Republic of Uzbekistan, painted in a unique cream-colored paint with sides measuring 80x82 mm, is placed. It is surrounded by a light cream-colored background with a small national pattern consisting of a patterned raster. In the upper part of the page, a cream-colored border 20 mm wide is drawn over the background, and the words “UZBEKISTAN REPUBLIKASI MAGISTR DIPLOMI” and “REPUBLIC OF UZBEKISTAN MASTER'S DIPLOMA” are printed on both pages of the diploma above the border.</w:t>
+        <w:t>Sahifaning markaziy oq qismida 80x82 mm o'lchamli o'ziga xos krem rangda bo'yalgan O'zbekiston Respublikasining Davlat gerbi tasviri joylashtirilgan. Uni karamel rangli halqasimon naqsh o'rab turadi.</w:t>
       </w:r>
     </w:p>
     <w:p>
@@ -989,7 +939,7 @@
         <w:jc w:val="both"/>
       </w:pPr>
       <w:r>
-        <w:t>The Latin letter M and an eight-digit number are printed in dark red at the bottom of the border of both pages of the diploma.</w:t>
+        <w:t>Diplom ikkala sahifasining chegarasining pastki qismida lotin harfi M va sakkiz xonali raqam to'q qizil rangda bosilgan.</w:t>
       </w:r>
     </w:p>
     <w:p>
@@ -997,7 +947,7 @@
         <w:jc w:val="both"/>
       </w:pPr>
       <w:r>
-        <w:t>A golden image of an eight-pointed star is placed on both sides of each page. The eight-pointed stars are formed by inserting squares with sides of 15x15 mm. Also, a QR code system of 35x35 mm in size without a background is placed at the bottom right of the diploma form.</w:t>
+        <w:t>Har bir sahifaning ikki tomonida sakkiz qirrali yulduzning oltin rangli tasviri joylashtirilgan. Sakkiz qirrali yulduzlar 15x15 mm tomonlari bo'lgan kvadratlarni kiritish orqali hosil qilinadi. Shuningdek, 35x35 mm o'lchamli QR-kod tizimi joylashtirilgan.</w:t>
       </w:r>
     </w:p>
     <w:p>
@@ -1005,7 +955,7 @@
         <w:jc w:val="both"/>
       </w:pPr>
       <w:r>
-        <w:t>The diploma has 7 levels of protection:</w:t>
+        <w:t>Diplomda 7 daraja himoya mavjud:</w:t>
       </w:r>
     </w:p>
     <w:p>
@@ -1013,7 +963,7 @@
         <w:jc w:val="both"/>
       </w:pPr>
       <w:r>
-        <w:t>1) using two different printing methods: offset printing method for the main part, and high-speed printing method for printing numbers;</w:t>
+        <w:t>1) ikki xil bosma usulidan foydalanish: asosiy qism uchun ofset bosma usuli, raqamlarni bosish uchun esa tezkor bosma usuli;</w:t>
       </w:r>
     </w:p>
     <w:p>
@@ -1021,7 +971,7 @@
         <w:jc w:val="both"/>
       </w:pPr>
       <w:r>
-        <w:t>2) use of non-toxic inks that make copying by machine difficult;</w:t>
+        <w:t>2) mashina yordamida nusxalashni qiyinlashtiradigan zaharli bo'lmagan bo'yoqlardan foydalanish;</w:t>
       </w:r>
     </w:p>
     <w:p>
@@ -1029,7 +979,7 @@
         <w:jc w:val="both"/>
       </w:pPr>
       <w:r>
-        <w:t>3) printing a small national pattern in the background using raster grids;</w:t>
+        <w:t>3) fonda rastr panjaralari yordamida mayda milliy naqshni bosish;</w:t>
       </w:r>
     </w:p>
     <w:p>
@@ -1037,17 +987,14 @@
         <w:jc w:val="both"/>
       </w:pPr>
       <w:r>
-        <w:t>4) use of watermarked paper with a special national ornamental pattern and a density of 120 g/m</w:t>
+        <w:t>4) maxsus milliy naqshli va 120 g/m2 zichligi bo'lgan suv belgilari qog'ozidan foydalanish;</w:t>
       </w:r>
       <w:proofErr w:type="gramStart"/>
-      <w:r>
-        <w:t xml:space="preserve">2 </w:t>
-      </w:r>
+      <w:r/>
       <w:r>
         <w:rPr>
           <w:vertAlign w:val="superscript"/>
         </w:rPr>
-        <w:t>;</w:t>
       </w:r>
       <w:proofErr w:type="gramEnd"/>
     </w:p>
@@ -1056,7 +1003,7 @@
         <w:jc w:val="both"/>
       </w:pPr>
       <w:r>
-        <w:t>5) Depicting the state emblem in light cream color;</w:t>
+        <w:t>5) davlat gerbini och krem rangda tasvirlash;</w:t>
       </w:r>
     </w:p>
     <w:p>
@@ -1064,7 +1011,7 @@
         <w:jc w:val="both"/>
       </w:pPr>
       <w:r>
-        <w:t>6) depicting eight-pointed stars in special shiny gold paints;</w:t>
+        <w:t>6) sakkiz qirrali yulduzlarni maxsus yaltiroq oltin bo'yoqlarda tasvirlash;</w:t>
       </w:r>
     </w:p>
     <w:p>
@@ -1072,8 +1019,7 @@
         <w:jc w:val="both"/>
       </w:pPr>
       <w:r>
-        <w:lastRenderedPageBreak/>
-        <w:t>7) Using a figure-of-eight variable number.</w:t>
+        <w:t>7) sakkizlik o'zgaruvchan raqamdan foydalanish.</w:t>
       </w:r>
     </w:p>
     <w:p>
@@ -1081,7 +1027,7 @@
         <w:jc w:val="both"/>
       </w:pPr>
       <w:r>
-        <w:t xml:space="preserve">ANNEX 2 </w:t>
+        <w:t>Vazirlar Mahkamasining 2019 yil 19 iyuldagi 607-sonli qaroriga 2-ILOVA</w:t>
       </w:r>
       <w:hyperlink r:id="rId17" w:history="1">
         <w:r>
@@ -1091,12 +1037,8 @@
           <w:t>to the Resolution</w:t>
         </w:r>
       </w:hyperlink>
-      <w:r>
-        <w:t xml:space="preserve"> of the Cabinet of Ministers No. 607 of July 19, 2019</w:t>
-      </w:r>
-      <w:r>
-        <w:br/>
-      </w:r>
+      <w:r/>
+      <w:r/>
     </w:p>
     <w:p>
       <w:pPr>
@@ -1109,7 +1051,7 @@
         <w:rPr>
           <w:b/>
         </w:rPr>
-        <w:t>State samples of applications for bachelor's and master's diplomas of higher education</w:t>
+        <w:t>Oliy ta'limning bakalavriat va magistratura diplomlariga ilovalarning Davlat namunalari</w:t>
       </w:r>
     </w:p>
     <w:tbl>
@@ -1218,7 +1160,7 @@
               <w:rPr>
                 <w:b/>
               </w:rPr>
-              <w:t>1. INFORMATION ABOUT THE HOLDER OF THE DIPLOMA</w:t>
+              <w:t>1. DIPLOM EGASI HAQIDA MA'LUMOT</w:t>
             </w:r>
           </w:p>
         </w:tc>
@@ -1328,7 +1270,7 @@
               <w:jc w:val="both"/>
             </w:pPr>
             <w:r>
-              <w:t>1.1 Surname/Surname</w:t>
+              <w:t>1.1 Familiya/Surname</w:t>
             </w:r>
           </w:p>
         </w:tc>
@@ -1356,16 +1298,12 @@
               <w:jc w:val="both"/>
             </w:pPr>
             <w:r>
-              <w:t xml:space="preserve">1.2 Name, father's name/Name, </w:t>
+              <w:t>1.2 Ism, otasining ismi/Name, other name</w:t>
             </w:r>
             <w:proofErr w:type="gramStart"/>
-            <w:r>
-              <w:t>other</w:t>
-            </w:r>
+            <w:r/>
             <w:proofErr w:type="gramEnd"/>
-            <w:r>
-              <w:t xml:space="preserve"> name</w:t>
-            </w:r>
+            <w:r/>
           </w:p>
         </w:tc>
       </w:tr>
@@ -1419,7 +1357,7 @@
               <w:jc w:val="both"/>
             </w:pPr>
             <w:r>
-              <w:t>1.3 Date of birth</w:t>
+              <w:t>1.3 Tug'ilgan sanasi</w:t>
             </w:r>
           </w:p>
         </w:tc>
@@ -1447,7 +1385,7 @@
               <w:jc w:val="both"/>
             </w:pPr>
             <w:r>
-              <w:t>1.4 Student's identification number and code</w:t>
+              <w:t>1.4 Talabaning identifikatsiya raqami va kodi</w:t>
             </w:r>
           </w:p>
         </w:tc>
@@ -1502,7 +1440,7 @@
               <w:jc w:val="both"/>
             </w:pPr>
             <w:r>
-              <w:t>1.5 Previous education document</w:t>
+              <w:t>1.5 Oldingi ta'lim hujjati</w:t>
             </w:r>
           </w:p>
         </w:tc>
@@ -1831,7 +1769,7 @@
               <w:rPr>
                 <w:b/>
               </w:rPr>
-              <w:t>2. QUALIFICATION INFORMATION</w:t>
+              <w:t>2. MALAKA HAQIDA MA'LUMOT</w:t>
             </w:r>
           </w:p>
         </w:tc>
@@ -1890,7 +1828,7 @@
               <w:jc w:val="both"/>
             </w:pPr>
             <w:r>
-              <w:t>2.1 Qualification (level) name, date of issue/Qualification, date of issue</w:t>
+              <w:t>2.1 Malaka (daraja) nomi, berilgan sanasi/Qualification,</w:t>
             </w:r>
           </w:p>
         </w:tc>
@@ -1962,7 +1900,7 @@
               <w:jc w:val="both"/>
             </w:pPr>
             <w:r>
-              <w:t>Decision of the State Attestation Commission</w:t>
+              <w:t>Davlat attestatsiya komissiyasining qarori</w:t>
             </w:r>
           </w:p>
         </w:tc>
@@ -1996,7 +1934,7 @@
               <w:jc w:val="both"/>
             </w:pPr>
             <w:r>
-              <w:t>(application is not valid without diploma about the degree)</w:t>
+              <w:t>(ilova daraja to'g'risidagi diplomsiz haqiqiy emas)</w:t>
             </w:r>
           </w:p>
         </w:tc>
@@ -2145,7 +2083,7 @@
               <w:jc w:val="both"/>
             </w:pPr>
             <w:r>
-              <w:t>2.2 Field of study, specialization</w:t>
+              <w:t>2.2 Ta'lim yo'nalishi, mutaxassislik</w:t>
             </w:r>
           </w:p>
         </w:tc>
@@ -2270,7 +2208,7 @@
               <w:jc w:val="both"/>
             </w:pPr>
             <w:r>
-              <w:t>2.3 Qualification</w:t>
+              <w:t>2.3 Malaka</w:t>
             </w:r>
           </w:p>
         </w:tc>
@@ -2360,7 +2298,7 @@
               <w:jc w:val="both"/>
             </w:pPr>
             <w:r>
-              <w:t>Details of the higher education institution: mailing address, city, street, house number, telephone numbers, email address</w:t>
+              <w:t>Oliy ta'lim muassasasining rekvizitlari: pochta manzili</w:t>
             </w:r>
           </w:p>
         </w:tc>
@@ -2388,7 +2326,7 @@
               <w:jc w:val="both"/>
             </w:pPr>
             <w:r>
-              <w:t>2.4 Name, organizational and legal form, type of educational institution that awarded the diploma/Awarding institution</w:t>
+              <w:t>2.4 Ta'lim muassasasining nomi, tashkiliy-huquqiy shakli, turi</w:t>
             </w:r>
           </w:p>
         </w:tc>
@@ -2478,7 +2416,7 @@
               <w:jc w:val="both"/>
             </w:pPr>
             <w:r>
-              <w:t>Requisites of higher education institution: postal address, city, street, house number, telephone number, e-mail address</w:t>
+              <w:t xml:space="preserve">Oliy ta'lim muassasasining rekvizitlari: pochta manzili, </w:t>
             </w:r>
           </w:p>
         </w:tc>
@@ -2506,7 +2444,7 @@
               <w:jc w:val="both"/>
             </w:pPr>
             <w:r>
-              <w:t>2.5 Name and organizational and legal form of the higher education institution where the student previously studied, period of study/Former Institution administered studies.</w:t>
+              <w:t>2.5 Oliy ta'lim muassasasining nomi va tashkiliy-huquqiy shakli</w:t>
             </w:r>
           </w:p>
         </w:tc>
@@ -2540,7 +2478,7 @@
               <w:jc w:val="both"/>
             </w:pPr>
             <w:r>
-              <w:t>2.6 Language(s) of instruction (examination)</w:t>
+              <w:t>2.6 Ta'lim (imtihon) tili (tillari)</w:t>
             </w:r>
           </w:p>
         </w:tc>
@@ -2608,7 +2546,7 @@
               <w:rPr>
                 <w:b/>
               </w:rPr>
-              <w:t>3. INFORMATION ON TNE LEVEL OF EDUCATION</w:t>
+              <w:t>3. TA'LIM DARAJASI HAQIDA MA'LUMOT</w:t>
             </w:r>
           </w:p>
         </w:tc>
@@ -2673,7 +2611,7 @@
               <w:jc w:val="both"/>
             </w:pPr>
             <w:r>
-              <w:t>3.1 Level of education</w:t>
+              <w:t>3.1 Ta'lim darajasi</w:t>
             </w:r>
           </w:p>
         </w:tc>
@@ -2738,7 +2676,7 @@
               <w:jc w:val="both"/>
             </w:pPr>
             <w:r>
-              <w:t>3.2 Length of full-time programme.</w:t>
+              <w:t>3.2 Kunduzgi ta'lim dasturining davomiyligi.</w:t>
             </w:r>
           </w:p>
         </w:tc>
@@ -2803,7 +2741,7 @@
               <w:jc w:val="both"/>
             </w:pPr>
             <w:r>
-              <w:t>3.3 Admission requirement(s)</w:t>
+              <w:t>3.3 Qabul talablari</w:t>
             </w:r>
           </w:p>
         </w:tc>
@@ -2902,7 +2840,7 @@
               <w:rPr>
                 <w:b/>
               </w:rPr>
-              <w:t>4. INFORMATION ON THE CONTENTS OF STUDY AND GRADES OBTAINED</w:t>
+              <w:t>4. O'QISH MAZMUNI VA OLINGAN BAHOLAR HAQIDA MA'LUMOT</w:t>
             </w:r>
           </w:p>
         </w:tc>
@@ -2967,7 +2905,7 @@
               <w:jc w:val="both"/>
             </w:pPr>
             <w:r>
-              <w:t>4.1 Type of study</w:t>
+              <w:t>4.1 Ta'lim turi</w:t>
             </w:r>
           </w:p>
         </w:tc>
@@ -3033,7 +2971,7 @@
               <w:jc w:val="both"/>
             </w:pPr>
             <w:r>
-              <w:t>4.2 Curriculum description</w:t>
+              <w:t>4.2 O'quv rejasi tavsifi</w:t>
             </w:r>
           </w:p>
         </w:tc>
@@ -3559,7 +3497,7 @@
               <w:jc w:val="both"/>
             </w:pPr>
             <w:r>
-              <w:t>Student's FIO/Student full name</w:t>
+              <w:t>Talabaning F.I.O./Student full name</w:t>
             </w:r>
           </w:p>
         </w:tc>
@@ -3607,7 +3545,7 @@
               <w:jc w:val="both"/>
             </w:pPr>
             <w:r>
-              <w:t>4.3 Information about the results of mastering the educational program/Programme details and grades obtained</w:t>
+              <w:t>4.3 Ta'lim dasturini o'zlashtirish natijalari haqida ma'lumot</w:t>
             </w:r>
           </w:p>
         </w:tc>
@@ -3682,62 +3620,62 @@
               <w:jc w:val="both"/>
             </w:pPr>
             <w:r>
-              <w:t>Name of subject (module)/Course title</w:t>
-            </w:r>
-          </w:p>
-        </w:tc>
-        <w:tc>
-          <w:tcPr>
-            <w:tcW w:w="0" w:type="auto"/>
-            <w:gridSpan w:val="3"/>
-            <w:tcBorders>
-              <w:top w:val="single" w:sz="6" w:space="0" w:color="000000"/>
-              <w:left w:val="single" w:sz="6" w:space="0" w:color="000000"/>
-              <w:bottom w:val="single" w:sz="6" w:space="0" w:color="000000"/>
-              <w:right w:val="single" w:sz="6" w:space="0" w:color="000000"/>
-            </w:tcBorders>
-            <w:shd w:val="clear" w:color="auto" w:fill="FFFFFF"/>
-            <w:tcMar>
-              <w:top w:w="15" w:type="dxa"/>
-              <w:left w:w="30" w:type="dxa"/>
-              <w:bottom w:w="15" w:type="dxa"/>
-              <w:right w:w="15" w:type="dxa"/>
-            </w:tcMar>
-            <w:hideMark/>
-          </w:tcPr>
-          <w:p>
-            <w:pPr>
-              <w:jc w:val="both"/>
-            </w:pPr>
-            <w:r>
-              <w:t>Total hours in the curriculum</w:t>
-            </w:r>
-          </w:p>
-        </w:tc>
-        <w:tc>
-          <w:tcPr>
-            <w:tcW w:w="0" w:type="auto"/>
-            <w:tcBorders>
-              <w:top w:val="single" w:sz="6" w:space="0" w:color="000000"/>
-              <w:left w:val="single" w:sz="6" w:space="0" w:color="000000"/>
-              <w:bottom w:val="single" w:sz="6" w:space="0" w:color="000000"/>
-              <w:right w:val="single" w:sz="6" w:space="0" w:color="000000"/>
-            </w:tcBorders>
-            <w:shd w:val="clear" w:color="auto" w:fill="FFFFFF"/>
-            <w:tcMar>
-              <w:top w:w="15" w:type="dxa"/>
-              <w:left w:w="30" w:type="dxa"/>
-              <w:bottom w:w="15" w:type="dxa"/>
-              <w:right w:w="15" w:type="dxa"/>
-            </w:tcMar>
-            <w:hideMark/>
-          </w:tcPr>
-          <w:p>
-            <w:pPr>
-              <w:jc w:val="both"/>
-            </w:pPr>
-            <w:r>
-              <w:t>Grade (score, rating, mark, credit)</w:t>
+              <w:t>Fan (modul) nomi/Course title</w:t>
+            </w:r>
+          </w:p>
+        </w:tc>
+        <w:tc>
+          <w:tcPr>
+            <w:tcW w:w="0" w:type="auto"/>
+            <w:gridSpan w:val="3"/>
+            <w:tcBorders>
+              <w:top w:val="single" w:sz="6" w:space="0" w:color="000000"/>
+              <w:left w:val="single" w:sz="6" w:space="0" w:color="000000"/>
+              <w:bottom w:val="single" w:sz="6" w:space="0" w:color="000000"/>
+              <w:right w:val="single" w:sz="6" w:space="0" w:color="000000"/>
+            </w:tcBorders>
+            <w:shd w:val="clear" w:color="auto" w:fill="FFFFFF"/>
+            <w:tcMar>
+              <w:top w:w="15" w:type="dxa"/>
+              <w:left w:w="30" w:type="dxa"/>
+              <w:bottom w:w="15" w:type="dxa"/>
+              <w:right w:w="15" w:type="dxa"/>
+            </w:tcMar>
+            <w:hideMark/>
+          </w:tcPr>
+          <w:p>
+            <w:pPr>
+              <w:jc w:val="both"/>
+            </w:pPr>
+            <w:r>
+              <w:t>O'quv rejasidagi jami soatlar</w:t>
+            </w:r>
+          </w:p>
+        </w:tc>
+        <w:tc>
+          <w:tcPr>
+            <w:tcW w:w="0" w:type="auto"/>
+            <w:tcBorders>
+              <w:top w:val="single" w:sz="6" w:space="0" w:color="000000"/>
+              <w:left w:val="single" w:sz="6" w:space="0" w:color="000000"/>
+              <w:bottom w:val="single" w:sz="6" w:space="0" w:color="000000"/>
+              <w:right w:val="single" w:sz="6" w:space="0" w:color="000000"/>
+            </w:tcBorders>
+            <w:shd w:val="clear" w:color="auto" w:fill="FFFFFF"/>
+            <w:tcMar>
+              <w:top w:w="15" w:type="dxa"/>
+              <w:left w:w="30" w:type="dxa"/>
+              <w:bottom w:w="15" w:type="dxa"/>
+              <w:right w:w="15" w:type="dxa"/>
+            </w:tcMar>
+            <w:hideMark/>
+          </w:tcPr>
+          <w:p>
+            <w:pPr>
+              <w:jc w:val="both"/>
+            </w:pPr>
+            <w:r>
+              <w:t>Baho (ball, reyting, belgi, kredit)</w:t>
             </w:r>
           </w:p>
         </w:tc>
@@ -10174,7 +10112,7 @@
               <w:rPr>
                 <w:b/>
               </w:rPr>
-              <w:t>TOTAL</w:t>
+              <w:t>JAMI</w:t>
             </w:r>
           </w:p>
         </w:tc>
@@ -10304,7 +10242,7 @@
               <w:rPr>
                 <w:b/>
               </w:rPr>
-              <w:t>Course papers:</w:t>
+              <w:t>Kurs ishlari:</w:t>
             </w:r>
           </w:p>
         </w:tc>
@@ -10942,14 +10880,14 @@
               <w:rPr>
                 <w:b/>
               </w:rPr>
-              <w:t>Qualification</w:t>
+              <w:t>Malakaviy</w:t>
+              <w:br/>
+              <w:t>amaliyot</w:t>
             </w:r>
             <w:r>
               <w:rPr>
                 <w:b/>
               </w:rPr>
-              <w:br/>
-              <w:t>practice</w:t>
             </w:r>
           </w:p>
         </w:tc>
@@ -11601,26 +11539,25 @@
               <w:rPr>
                 <w:b/>
               </w:rPr>
-              <w:t>Final state attestation/</w:t>
+              <w:t>Yakuniy davlat attestatsiyasi/</w:t>
+              <w:br/>
+              <w:t>‎Final state attestation</w:t>
             </w:r>
             <w:r>
               <w:rPr>
                 <w:b/>
               </w:rPr>
-              <w:br/>
             </w:r>
             <w:r>
               <w:rPr>
                 <w:b/>
                 <w:cs/>
               </w:rPr>
-              <w:t>‎</w:t>
             </w:r>
             <w:r>
               <w:rPr>
                 <w:b/>
               </w:rPr>
-              <w:t>Final state attestation</w:t>
             </w:r>
           </w:p>
         </w:tc>
@@ -12271,7 +12208,7 @@
               <w:rPr>
                 <w:b/>
               </w:rPr>
-              <w:t>Graduation qualification work (master's dissertation)</w:t>
+              <w:t>Bitiruv malakaviy ishi (magistrlik dissertatsiyasi)</w:t>
             </w:r>
           </w:p>
         </w:tc>
@@ -12537,7 +12474,7 @@
               <w:jc w:val="both"/>
             </w:pPr>
             <w:r>
-              <w:t>4.4 Grading system at higher education institution</w:t>
+              <w:t>4.4 Oliy ta'lim muassasasidagi baholash tizimi</w:t>
             </w:r>
           </w:p>
         </w:tc>
@@ -12630,7 +12567,7 @@
               <w:jc w:val="both"/>
             </w:pPr>
             <w:r>
-              <w:t>4.5 Additional information to the degree</w:t>
+              <w:t>4.5 Darajaga qo'shimcha ma'lumot</w:t>
             </w:r>
           </w:p>
         </w:tc>
@@ -12726,7 +12663,7 @@
               <w:rPr>
                 <w:b/>
               </w:rPr>
-              <w:t>5. RIGHTS AND PRIVILEGES PROVIDED BY THE DEGREE</w:t>
+              <w:t>5. DARAJA TOMONIDAN BERILGAN HUQUQ VA IMTIYOZLAR</w:t>
             </w:r>
           </w:p>
         </w:tc>
@@ -12819,7 +12756,7 @@
               <w:jc w:val="both"/>
             </w:pPr>
             <w:r>
-              <w:t>5.1 Access to further study</w:t>
+              <w:t>5.1 Keyingi ta'limga kirish imkoniyati</w:t>
             </w:r>
           </w:p>
         </w:tc>
@@ -12912,7 +12849,7 @@
               <w:jc w:val="both"/>
             </w:pPr>
             <w:r>
-              <w:t>5.2 Professional status</w:t>
+              <w:t>5.2 Kasbiy maqom</w:t>
             </w:r>
           </w:p>
         </w:tc>
@@ -13008,7 +12945,7 @@
               <w:rPr>
                 <w:b/>
               </w:rPr>
-              <w:t>6. ADDITIONAL INFORMATION</w:t>
+              <w:t>6. QO'SHIMCHA MA'LUMOT</w:t>
             </w:r>
           </w:p>
         </w:tc>
@@ -13104,7 +13041,7 @@
               <w:rPr>
                 <w:b/>
               </w:rPr>
-              <w:t>SIGNATURE AND SEAL/SIGNATURE AND SEAL</w:t>
+              <w:t>IMZO VA MUHR/SIGNATURE AND SEAL</w:t>
             </w:r>
           </w:p>
         </w:tc>
@@ -13197,7 +13134,7 @@
               <w:jc w:val="both"/>
             </w:pPr>
             <w:r>
-              <w:t>Rector/Rector</w:t>
+              <w:t>Rektor/Rector</w:t>
             </w:r>
           </w:p>
         </w:tc>
@@ -13290,7 +13227,7 @@
               <w:jc w:val="both"/>
             </w:pPr>
             <w:r>
-              <w:t>Diploma supplement</w:t>
+              <w:t>Diplomga ilova</w:t>
             </w:r>
           </w:p>
         </w:tc>
@@ -13383,7 +13320,7 @@
               <w:jc w:val="both"/>
             </w:pPr>
             <w:r>
-              <w:t>Diploma supplement</w:t>
+              <w:t>Diplomga ilova</w:t>
             </w:r>
           </w:p>
         </w:tc>
@@ -13476,7 +13413,7 @@
               <w:jc w:val="both"/>
             </w:pPr>
             <w:r>
-              <w:t>Registration number</w:t>
+              <w:t>Ro'yxatga olish raqami</w:t>
             </w:r>
           </w:p>
         </w:tc>
@@ -13569,7 +13506,7 @@
               <w:jc w:val="both"/>
             </w:pPr>
             <w:r>
-              <w:t>Date of issue</w:t>
+              <w:t>Berilgan sanasi</w:t>
             </w:r>
           </w:p>
         </w:tc>
@@ -13593,7 +13530,7 @@
         <w:jc w:val="both"/>
       </w:pPr>
       <w:r>
-        <w:t xml:space="preserve">ANNEX 3 </w:t>
+        <w:t>Vazirlar Mahkamasining 2019 yil 19 iyuldagi 607-sonli qaroriga 3-ILOVA</w:t>
       </w:r>
       <w:hyperlink r:id="rId19" w:history="1">
         <w:r>
@@ -13603,12 +13540,8 @@
           <w:t>to the Resolution</w:t>
         </w:r>
       </w:hyperlink>
-      <w:r>
-        <w:t xml:space="preserve"> of the Cabinet of Ministers No. 607 of July 19, 2019</w:t>
-      </w:r>
-      <w:r>
-        <w:br/>
-      </w:r>
+      <w:r/>
+      <w:r/>
     </w:p>
     <w:p>
       <w:pPr>
@@ -13621,7 +13554,7 @@
         <w:rPr>
           <w:b/>
         </w:rPr>
-        <w:t>State sample and description of academic transcripts issued in higher education institutions</w:t>
+        <w:t>Oliy ta'lim muassasalarida beriladigan akademik ma'lumotnomaning Davlat namunasi va tavsifi</w:t>
       </w:r>
     </w:p>
     <w:p>
@@ -14010,7 +13943,7 @@
               <w:jc w:val="both"/>
             </w:pPr>
             <w:r>
-              <w:t>(Last name, first name, patronymic)</w:t>
+              <w:t>(Familiya, ism, otasining ismi)</w:t>
             </w:r>
           </w:p>
         </w:tc>
@@ -14046,7 +13979,7 @@
               <w:rPr>
                 <w:b/>
               </w:rPr>
-              <w:t>I. List of subjects studied:</w:t>
+              <w:t>I. O'rganilgan fanlar ro'yxati:</w:t>
             </w:r>
           </w:p>
         </w:tc>
@@ -14112,7 +14045,7 @@
               <w:rPr>
                 <w:b/>
               </w:rPr>
-              <w:t>Name of subjects studied</w:t>
+              <w:t>O'rganilgan fanlar nomi</w:t>
             </w:r>
           </w:p>
         </w:tc>
@@ -14143,7 +14076,7 @@
               <w:rPr>
                 <w:b/>
               </w:rPr>
-              <w:t>The number of hours specified in the curriculum</w:t>
+              <w:t>O'quv rejasida belgilangan soatlar soni</w:t>
             </w:r>
           </w:p>
         </w:tc>
@@ -14174,7 +14107,7 @@
               <w:rPr>
                 <w:b/>
               </w:rPr>
-              <w:t>Mastery indicator (rating/grade/credit)</w:t>
+              <w:t>O'zlashtirish ko'rsatkichi (reyting/baho/kredit)</w:t>
             </w:r>
           </w:p>
         </w:tc>
@@ -14338,8 +14271,7 @@
               <w:rPr>
                 <w:b/>
               </w:rPr>
-              <w:lastRenderedPageBreak/>
-              <w:t>Subjects in the curriculum:</w:t>
+              <w:t>O'quv rejasidagi fanlar:</w:t>
             </w:r>
           </w:p>
         </w:tc>
@@ -17769,7 +17701,7 @@
               <w:rPr>
                 <w:b/>
               </w:rPr>
-              <w:t>Additional subjects learned:</w:t>
+              <w:t>Qo'shimcha o'rganilgan fanlar:</w:t>
             </w:r>
           </w:p>
         </w:tc>
@@ -18935,7 +18867,7 @@
               <w:rPr>
                 <w:b/>
               </w:rPr>
-              <w:t>Total:</w:t>
+              <w:t>Jami:</w:t>
             </w:r>
           </w:p>
         </w:tc>
@@ -19051,8 +18983,7 @@
               <w:rPr>
                 <w:b/>
               </w:rPr>
-              <w:lastRenderedPageBreak/>
-              <w:t>II. Course project (work):</w:t>
+              <w:t>II. Kurs loyihasi (ishi):</w:t>
             </w:r>
           </w:p>
         </w:tc>
@@ -19812,14 +19743,13 @@
               <w:rPr>
                 <w:b/>
               </w:rPr>
-              <w:t>III. Qualification practices:</w:t>
+              <w:t>III. Malakaviy amaliyotlar:‎</w:t>
             </w:r>
             <w:r>
               <w:rPr>
                 <w:b/>
                 <w:cs/>
               </w:rPr>
-              <w:t>‎</w:t>
             </w:r>
           </w:p>
         </w:tc>
@@ -20468,7 +20398,7 @@
               <w:rPr>
                 <w:b/>
               </w:rPr>
-              <w:t>IV. State and final certifications</w:t>
+              <w:t>IV. Davlat va yakuniy attestatsiyalar</w:t>
             </w:r>
           </w:p>
         </w:tc>
@@ -21271,7 +21201,7 @@
               <w:jc w:val="both"/>
             </w:pPr>
             <w:r>
-              <w:t>Rector:</w:t>
+              <w:t>Rektor:</w:t>
             </w:r>
           </w:p>
         </w:tc>
@@ -21422,7 +21352,7 @@
               <w:jc w:val="both"/>
             </w:pPr>
             <w:r>
-              <w:t>Dean:</w:t>
+              <w:t>Dekan:</w:t>
             </w:r>
           </w:p>
         </w:tc>
@@ -21573,7 +21503,7 @@
               <w:jc w:val="both"/>
             </w:pPr>
             <w:r>
-              <w:t>Secretary:</w:t>
+              <w:t>Kotib:</w:t>
             </w:r>
           </w:p>
         </w:tc>
@@ -22467,7 +22397,7 @@
               <w:jc w:val="both"/>
             </w:pPr>
             <w:r>
-              <w:t>An academic transcript is a document that is strictly recorded.</w:t>
+              <w:t>Akademik ma'lumotnoma qat'iy hisobga olinadigan hujjat hisoblanadi</w:t>
             </w:r>
           </w:p>
         </w:tc>
@@ -22500,7 +22430,7 @@
               <w:jc w:val="both"/>
             </w:pPr>
             <w:r>
-              <w:t>Forgery is punishable by law.</w:t>
+              <w:t>Qalbakilashtirish qonun bo'yicha jazolanadi.</w:t>
             </w:r>
           </w:p>
         </w:tc>
@@ -22517,7 +22447,7 @@
         <w:rPr>
           <w:b/>
         </w:rPr>
-        <w:t>Academic transcript</w:t>
+        <w:t>Akademik ma'lumotnoma</w:t>
       </w:r>
     </w:p>
     <w:p>
@@ -22531,7 +22461,7 @@
         <w:rPr>
           <w:b/>
         </w:rPr>
-        <w:t>DESCRIPTION</w:t>
+        <w:t>TAVSIF</w:t>
       </w:r>
     </w:p>
     <w:p>
@@ -22539,7 +22469,7 @@
         <w:jc w:val="both"/>
       </w:pPr>
       <w:r>
-        <w:t>The academic transcript is printed using offset printing on watermarked paper, with the text in black and the background in light blue.</w:t>
+        <w:t>Akademik ma'lumotnoma ofset bosma usulida suv belgilari qog'oziga bosiladi, matni qora rangda, foni esa och ko'k rangda.</w:t>
       </w:r>
     </w:p>
     <w:p>
@@ -22547,15 +22477,19 @@
         <w:jc w:val="both"/>
       </w:pPr>
       <w:r>
-        <w:t xml:space="preserve">The image of the State Emblem of the Republic of Uzbekistan is depicted, below it </w:t>
+        <w:t>O'zbekiston Respublikasining Davlat gerbi tasviri tasvirlangan, uning ostida "O'ZBEKISTON RESPUBLIKASI", "shahar nomi", "ta'lim muassasasi nomi" va "AKADEMIK MA'LUMOTNOMA" so'zlari lotin yozuvida joylashtirilgan.</w:t>
       </w:r>
       <w:proofErr w:type="gramStart"/>
+      <w:r/>
+      <w:proofErr w:type="gramEnd"/>
+      <w:r/>
+    </w:p>
+    <w:p>
+      <w:pPr>
+        <w:jc w:val="both"/>
+      </w:pPr>
       <w:r>
-        <w:t>are</w:t>
-      </w:r>
-      <w:proofErr w:type="gramEnd"/>
-      <w:r>
-        <w:t xml:space="preserve"> the words "REPUBLIC OF UZBEKISTAN", "city name", "educational institution name", and "ACADEMIC REFERENCE" in Latin script.</w:t>
+        <w:t>Akademik ma'lumotnomasiga "AKADEMIK MA'LUMOTNOMA" so'zining ostida lotin harfi "VA" va olti xonali raqam qo'yiladi (bosiladi).</w:t>
       </w:r>
     </w:p>
     <w:p>
@@ -22563,7 +22497,7 @@
         <w:jc w:val="both"/>
       </w:pPr>
       <w:r>
-        <w:t>The academic reference letter is stamped (printed) with the Latin letter "VA" and a six-digit number below the word "ACADEMIC REFERENCE".</w:t>
+        <w:t>Akademik ma'lumotnomada 5 daraja himoya mavjud:</w:t>
       </w:r>
     </w:p>
     <w:p>
@@ -22571,7 +22505,7 @@
         <w:jc w:val="both"/>
       </w:pPr>
       <w:r>
-        <w:t>The academic transcript has 5 levels of protection:</w:t>
+        <w:t>1) ikki xil bosma usulidan foydalanish: asosiy qism uchun ofset bosma usuli, raqamlarni bosish uchun esa tezkor bosma usuli;</w:t>
       </w:r>
     </w:p>
     <w:p>
@@ -22579,8 +22513,7 @@
         <w:jc w:val="both"/>
       </w:pPr>
       <w:r>
-        <w:lastRenderedPageBreak/>
-        <w:t>1) using two different printing methods: offset printing method for the main part, and high-speed printing method for printing numbers;</w:t>
+        <w:t>2) mashina yordamida nusxalashni qiyinlashtiradigan zaharli bo'lmagan bo'yoqlardan foydalanish;</w:t>
       </w:r>
     </w:p>
     <w:p>
@@ -22588,25 +22521,14 @@
         <w:jc w:val="both"/>
       </w:pPr>
       <w:r>
-        <w:t>2) use of non-toxic inks that make copying by machine difficult;</w:t>
-      </w:r>
-    </w:p>
-    <w:p>
-      <w:pPr>
-        <w:jc w:val="both"/>
-      </w:pPr>
-      <w:r>
-        <w:t>3) use of watermarked paper with a special national ornamental pattern and a density of 120 g/m</w:t>
+        <w:t>3) maxsus milliy naqshli va 120 g/m2 zichligi bo'lgan suv belgilari qog'ozidan foydalanish;</w:t>
       </w:r>
       <w:proofErr w:type="gramStart"/>
-      <w:r>
-        <w:t xml:space="preserve">2 </w:t>
-      </w:r>
+      <w:r/>
       <w:r>
         <w:rPr>
           <w:vertAlign w:val="superscript"/>
         </w:rPr>
-        <w:t>;</w:t>
       </w:r>
       <w:proofErr w:type="gramEnd"/>
     </w:p>
@@ -22615,7 +22537,7 @@
         <w:jc w:val="both"/>
       </w:pPr>
       <w:r>
-        <w:t>4) Depicting the state emblem in light blue;</w:t>
+        <w:t>4) davlat gerbini och ko'k rangda tasvirlash;</w:t>
       </w:r>
     </w:p>
     <w:p>
@@ -22623,7 +22545,7 @@
         <w:jc w:val="both"/>
       </w:pPr>
       <w:r>
-        <w:t>5) Using a seven-figure variable number.</w:t>
+        <w:t>5) yetti xonali o'zgaruvchan raqamdan foydalanish.</w:t>
       </w:r>
     </w:p>
     <w:p>

</xml_diff>